<commit_message>
Refresh CdL_PEST_strategy.docx with final Tikhonov strategy + results
Adds the adopted Tikhonov regularisation strategy (SS8), the regularised-vs-un-regularised results, and the effort summary (time and MODFLOW 6 runs, SS9).

Co-Authored-By: Claude Opus 4.8 <noreply@anthropic.com>
</commit_message>
<xml_diff>
--- a/CdL/docs/CdL_PEST_strategy.docx
+++ b/CdL/docs/CdL_PEST_strategy.docx
@@ -1269,7 +1269,803 @@
           <w:i/>
           <w:sz w:val="21"/>
         </w:rPr>
-        <w:t xml:space="preserve">In short: the rebuilt calibration is robust and fits heads and baseflow well, but the un-regularised posterior over-fits K to its physical bounds. Explicit smoothness regularisation is the priority next step, and the posterior K field and stream terms should be reported with smoothness- and identifiability-caveats.</w:t>
+        <w:t xml:space="preserve">In short: the rebuilt calibration is robust and fits heads and baseflow well, but the un-regularised posterior over-fits K to its physical bounds. Explicit smoothness regularisation was therefore adopted (§8), and the posterior K field and stream terms should be reported with smoothness- and identifiability-caveats.</w:t>
+      </w:r>
+    </w:p>
+    <w:p>
+      <w:pPr>
+        <w:pStyle w:val="Heading1"/>
+        <w:spacing w:before="160" w:after="60"/>
+      </w:pPr>
+      <w:r>
+        <w:rPr>
+          <w:color w:val="1F4E79"/>
+        </w:rPr>
+        <w:t xml:space="preserve">8. Final strategy: Tikhonov regularisation and results</w:t>
+      </w:r>
+    </w:p>
+    <w:p>
+      <w:pPr>
+        <w:spacing w:after="80"/>
+      </w:pPr>
+      <w:r>
+        <w:t xml:space="preserve">To address the over-fitting in §7, first-order Tikhonov (smoothness) regularisation was added to the pilot-point calibration and the IES re-run. This is the adopted final strategy.</w:t>
+      </w:r>
+    </w:p>
+    <w:p>
+      <w:pPr>
+        <w:pStyle w:val="ListBullet"/>
+        <w:spacing w:after="40"/>
+      </w:pPr>
+      <w:r>
+        <w:rPr>
+          <w:b/>
+        </w:rPr>
+        <w:t xml:space="preserve">Method. </w:t>
+      </w:r>
+      <w:r>
+        <w:t xml:space="preserve"> build_pst.py adds prior-information equations that penalise the LOG-K DIFFERENCE between spatially-correlated (neighbouring) Kh pilot points — preferred difference = 0 — built from the geostatistical prior covariance (saved as prior_cov.jcb). They enter the IES composite objective (phi) through pestpp-ies’s ies_reg_factor, set to 0.5 (the smoothness strength). So the geostatistical prior smooths the prior draw and Tikhonov keeps the field smooth through the ensemble update.</w:t>
+      </w:r>
+    </w:p>
+    <w:p>
+      <w:pPr>
+        <w:pStyle w:val="ListBullet"/>
+        <w:spacing w:after="40"/>
+      </w:pPr>
+      <w:r>
+        <w:rPr>
+          <w:b/>
+        </w:rPr>
+        <w:t xml:space="preserve">Implementation note (pestpp-ies 5.2.27). </w:t>
+      </w:r>
+      <w:r>
+        <w:t xml:space="preserve"> With regularisation active, the solver heap-crashes at a large ensemble with many prior-information equations (the composite-phi work scales with realisations × equations). Workaround: keep the equation count modest (abs_drop_tol = 0.60 → ~1 240 equations, vs ~8 500) so the 150-realisation load stays below the level that runs cleanly, and run with adaptive localization OFF (Tikhonov replaces it as the anti-checkerboard mechanism). A separate bug report documents this for the PEST++ developers.</w:t>
+      </w:r>
+    </w:p>
+    <w:p>
+      <w:pPr>
+        <w:spacing w:after="80"/>
+      </w:pPr>
+      <w:r>
+        <w:t xml:space="preserve">Results — regularised vs un-regularised (same targets, same 150-real ensemble):</w:t>
+      </w:r>
+    </w:p>
+    <w:tbl>
+      <w:tblPr>
+        <w:tblStyle w:val="LightGrid-Accent1"/>
+        <w:tblW w:type="auto" w:w="0"/>
+        <w:jc w:val="center"/>
+        <w:tblLook w:firstColumn="1" w:firstRow="1" w:lastColumn="0" w:lastRow="0" w:noHBand="0" w:noVBand="1" w:val="04A0"/>
+      </w:tblPr>
+      <w:tblGrid>
+        <w:gridCol w:w="3300"/>
+        <w:gridCol w:w="3000"/>
+        <w:gridCol w:w="2988"/>
+      </w:tblGrid>
+      <w:tr>
+        <w:tc>
+          <w:tcPr>
+            <w:tcW w:type="dxa" w:w="3300"/>
+          </w:tcPr>
+          <w:p>
+            <w:pPr>
+              <w:spacing w:after="20"/>
+            </w:pPr>
+            <w:r>
+              <w:rPr>
+                <w:b/>
+                <w:color w:val="FFFFFF"/>
+                <w:sz w:val="18"/>
+              </w:rPr>
+              <w:t xml:space="preserve">Metric</w:t>
+            </w:r>
+          </w:p>
+        </w:tc>
+        <w:tc>
+          <w:tcPr>
+            <w:tcW w:type="dxa" w:w="3000"/>
+          </w:tcPr>
+          <w:p>
+            <w:pPr>
+              <w:spacing w:after="20"/>
+            </w:pPr>
+            <w:r>
+              <w:rPr>
+                <w:b/>
+                <w:color w:val="FFFFFF"/>
+                <w:sz w:val="18"/>
+              </w:rPr>
+              <w:t xml:space="preserve">Un-regularised</w:t>
+            </w:r>
+          </w:p>
+        </w:tc>
+        <w:tc>
+          <w:tcPr>
+            <w:tcW w:type="dxa" w:w="2988"/>
+          </w:tcPr>
+          <w:p>
+            <w:pPr>
+              <w:spacing w:after="20"/>
+            </w:pPr>
+            <w:r>
+              <w:rPr>
+                <w:b/>
+                <w:color w:val="FFFFFF"/>
+                <w:sz w:val="18"/>
+              </w:rPr>
+              <w:t xml:space="preserve">Regularised (reg = 0.5)</w:t>
+            </w:r>
+          </w:p>
+        </w:tc>
+      </w:tr>
+      <w:tr>
+        <w:tc>
+          <w:tcPr>
+            <w:tcW w:type="dxa" w:w="3300"/>
+          </w:tcPr>
+          <w:p>
+            <w:pPr>
+              <w:spacing w:after="20"/>
+            </w:pPr>
+            <w:r>
+              <w:rPr>
+                <w:sz w:val="18"/>
+              </w:rPr>
+              <w:t xml:space="preserve">Kh pilot points at bounds (iter 1 / 2 / 3)</w:t>
+            </w:r>
+          </w:p>
+        </w:tc>
+        <w:tc>
+          <w:tcPr>
+            <w:tcW w:type="dxa" w:w="3000"/>
+          </w:tcPr>
+          <w:p>
+            <w:pPr>
+              <w:spacing w:after="20"/>
+            </w:pPr>
+            <w:r>
+              <w:rPr>
+                <w:sz w:val="18"/>
+              </w:rPr>
+              <w:t xml:space="preserve">44 / 61 / 59 %</w:t>
+            </w:r>
+          </w:p>
+        </w:tc>
+        <w:tc>
+          <w:tcPr>
+            <w:tcW w:type="dxa" w:w="2988"/>
+          </w:tcPr>
+          <w:p>
+            <w:pPr>
+              <w:spacing w:after="20"/>
+            </w:pPr>
+            <w:r>
+              <w:rPr>
+                <w:sz w:val="18"/>
+              </w:rPr>
+              <w:t xml:space="preserve">17 / 15 / 25 %</w:t>
+            </w:r>
+          </w:p>
+        </w:tc>
+      </w:tr>
+      <w:tr>
+        <w:tc>
+          <w:tcPr>
+            <w:tcW w:type="dxa" w:w="3300"/>
+          </w:tcPr>
+          <w:p>
+            <w:pPr>
+              <w:spacing w:after="20"/>
+            </w:pPr>
+            <w:r>
+              <w:rPr>
+                <w:sz w:val="18"/>
+              </w:rPr>
+              <w:t xml:space="preserve">mean phi reduction (prior → final)</w:t>
+            </w:r>
+          </w:p>
+        </w:tc>
+        <w:tc>
+          <w:tcPr>
+            <w:tcW w:type="dxa" w:w="3000"/>
+          </w:tcPr>
+          <w:p>
+            <w:pPr>
+              <w:spacing w:after="20"/>
+            </w:pPr>
+            <w:r>
+              <w:rPr>
+                <w:sz w:val="18"/>
+              </w:rPr>
+              <w:t xml:space="preserve">−56 %</w:t>
+            </w:r>
+          </w:p>
+        </w:tc>
+        <w:tc>
+          <w:tcPr>
+            <w:tcW w:type="dxa" w:w="2988"/>
+          </w:tcPr>
+          <w:p>
+            <w:pPr>
+              <w:spacing w:after="20"/>
+            </w:pPr>
+            <w:r>
+              <w:rPr>
+                <w:sz w:val="18"/>
+              </w:rPr>
+              <w:t xml:space="preserve">−28 %</w:t>
+            </w:r>
+          </w:p>
+        </w:tc>
+      </w:tr>
+      <w:tr>
+        <w:tc>
+          <w:tcPr>
+            <w:tcW w:type="dxa" w:w="3300"/>
+          </w:tcPr>
+          <w:p>
+            <w:pPr>
+              <w:spacing w:after="20"/>
+            </w:pPr>
+            <w:r>
+              <w:rPr>
+                <w:sz w:val="18"/>
+              </w:rPr>
+              <w:t xml:space="preserve">Head RMSE, posterior median</w:t>
+            </w:r>
+          </w:p>
+        </w:tc>
+        <w:tc>
+          <w:tcPr>
+            <w:tcW w:type="dxa" w:w="3000"/>
+          </w:tcPr>
+          <w:p>
+            <w:pPr>
+              <w:spacing w:after="20"/>
+            </w:pPr>
+            <w:r>
+              <w:rPr>
+                <w:sz w:val="18"/>
+              </w:rPr>
+              <w:t xml:space="preserve">1.47 m</w:t>
+            </w:r>
+          </w:p>
+        </w:tc>
+        <w:tc>
+          <w:tcPr>
+            <w:tcW w:type="dxa" w:w="2988"/>
+          </w:tcPr>
+          <w:p>
+            <w:pPr>
+              <w:spacing w:after="20"/>
+            </w:pPr>
+            <w:r>
+              <w:rPr>
+                <w:sz w:val="18"/>
+              </w:rPr>
+              <w:t xml:space="preserve">1.31 m</w:t>
+            </w:r>
+          </w:p>
+        </w:tc>
+      </w:tr>
+      <w:tr>
+        <w:tc>
+          <w:tcPr>
+            <w:tcW w:type="dxa" w:w="3300"/>
+          </w:tcPr>
+          <w:p>
+            <w:pPr>
+              <w:spacing w:after="20"/>
+            </w:pPr>
+            <w:r>
+              <w:rPr>
+                <w:sz w:val="18"/>
+              </w:rPr>
+              <w:t xml:space="preserve">Streamflow-outlet RMSE</w:t>
+            </w:r>
+          </w:p>
+        </w:tc>
+        <w:tc>
+          <w:tcPr>
+            <w:tcW w:type="dxa" w:w="3000"/>
+          </w:tcPr>
+          <w:p>
+            <w:pPr>
+              <w:spacing w:after="20"/>
+            </w:pPr>
+            <w:r>
+              <w:rPr>
+                <w:sz w:val="18"/>
+              </w:rPr>
+              <w:t xml:space="preserve">~29 %</w:t>
+            </w:r>
+          </w:p>
+        </w:tc>
+        <w:tc>
+          <w:tcPr>
+            <w:tcW w:type="dxa" w:w="2988"/>
+          </w:tcPr>
+          <w:p>
+            <w:pPr>
+              <w:spacing w:after="20"/>
+            </w:pPr>
+            <w:r>
+              <w:rPr>
+                <w:sz w:val="18"/>
+              </w:rPr>
+              <w:t xml:space="preserve">~29 %</w:t>
+            </w:r>
+          </w:p>
+        </w:tc>
+      </w:tr>
+      <w:tr>
+        <w:tc>
+          <w:tcPr>
+            <w:tcW w:type="dxa" w:w="3300"/>
+          </w:tcPr>
+          <w:p>
+            <w:pPr>
+              <w:spacing w:after="20"/>
+            </w:pPr>
+            <w:r>
+              <w:rPr>
+                <w:sz w:val="18"/>
+              </w:rPr>
+              <w:t xml:space="preserve">AET RMSE (bias)</w:t>
+            </w:r>
+          </w:p>
+        </w:tc>
+        <w:tc>
+          <w:tcPr>
+            <w:tcW w:type="dxa" w:w="3000"/>
+          </w:tcPr>
+          <w:p>
+            <w:pPr>
+              <w:spacing w:after="20"/>
+            </w:pPr>
+            <w:r>
+              <w:rPr>
+                <w:sz w:val="18"/>
+              </w:rPr>
+              <w:t xml:space="preserve">25.3 mm (−13.6)</w:t>
+            </w:r>
+          </w:p>
+        </w:tc>
+        <w:tc>
+          <w:tcPr>
+            <w:tcW w:type="dxa" w:w="2988"/>
+          </w:tcPr>
+          <w:p>
+            <w:pPr>
+              <w:spacing w:after="20"/>
+            </w:pPr>
+            <w:r>
+              <w:rPr>
+                <w:sz w:val="18"/>
+              </w:rPr>
+              <w:t xml:space="preserve">21.7 mm (−8.0)</w:t>
+            </w:r>
+          </w:p>
+        </w:tc>
+      </w:tr>
+    </w:tbl>
+    <w:p>
+      <w:pPr>
+        <w:spacing w:after="60"/>
+      </w:pPr>
+    </w:p>
+    <w:p>
+      <w:pPr>
+        <w:spacing w:after="80"/>
+      </w:pPr>
+      <w:r>
+        <w:t xml:space="preserve">The regularised calibration fits the data as well as the un-regularised one — heads slightly better, AET better, streamflow the same — but with less than half the bound-hitting (25 % vs 59 %). The un-regularised run’s larger phi reduction was largely spurious (bought with an unphysical, spatially-rough “checkerboard” K field); Tikhonov removes the over-fitting at no real cost to predictive skill, giving a smoother, more physical posterior K field. The best realisation (phi 2.32×10⁶) is exported to pest_optimised.npz and applied as the model warm-start.</w:t>
+      </w:r>
+    </w:p>
+    <w:p>
+      <w:pPr>
+        <w:pStyle w:val="Heading1"/>
+        <w:spacing w:before="160" w:after="60"/>
+      </w:pPr>
+      <w:r>
+        <w:rPr>
+          <w:color w:val="1F4E79"/>
+        </w:rPr>
+        <w:t xml:space="preserve">9. Effort: computer time and model runs</w:t>
+      </w:r>
+    </w:p>
+    <w:p>
+      <w:pPr>
+        <w:spacing w:after="80"/>
+      </w:pPr>
+      <w:r>
+        <w:t xml:space="preserve">Full campaign on the server (rebuild → final regularised calibration), 14 local PANTHER workers, ~38 min per MODFLOW 6 realisation (a full 557-period transient run):</w:t>
+      </w:r>
+    </w:p>
+    <w:tbl>
+      <w:tblPr>
+        <w:tblStyle w:val="LightGrid-Accent1"/>
+        <w:tblW w:type="auto" w:w="0"/>
+        <w:jc w:val="center"/>
+        <w:tblLook w:firstColumn="1" w:firstRow="1" w:lastColumn="0" w:lastRow="0" w:noHBand="0" w:noVBand="1" w:val="04A0"/>
+      </w:tblPr>
+      <w:tblGrid>
+        <w:gridCol w:w="4200"/>
+        <w:gridCol w:w="2544"/>
+        <w:gridCol w:w="2544"/>
+      </w:tblGrid>
+      <w:tr>
+        <w:tc>
+          <w:tcPr>
+            <w:tcW w:type="dxa" w:w="4200"/>
+          </w:tcPr>
+          <w:p>
+            <w:pPr>
+              <w:spacing w:after="20"/>
+            </w:pPr>
+            <w:r>
+              <w:rPr>
+                <w:b/>
+                <w:color w:val="FFFFFF"/>
+                <w:sz w:val="18"/>
+              </w:rPr>
+              <w:t xml:space="preserve">Stage</w:t>
+            </w:r>
+          </w:p>
+        </w:tc>
+        <w:tc>
+          <w:tcPr>
+            <w:tcW w:type="dxa" w:w="2544"/>
+          </w:tcPr>
+          <w:p>
+            <w:pPr>
+              <w:spacing w:after="20"/>
+            </w:pPr>
+            <w:r>
+              <w:rPr>
+                <w:b/>
+                <w:color w:val="FFFFFF"/>
+                <w:sz w:val="18"/>
+              </w:rPr>
+              <w:t xml:space="preserve">Wall-clock</w:t>
+            </w:r>
+          </w:p>
+        </w:tc>
+        <w:tc>
+          <w:tcPr>
+            <w:tcW w:type="dxa" w:w="2544"/>
+          </w:tcPr>
+          <w:p>
+            <w:pPr>
+              <w:spacing w:after="20"/>
+            </w:pPr>
+            <w:r>
+              <w:rPr>
+                <w:b/>
+                <w:color w:val="FFFFFF"/>
+                <w:sz w:val="18"/>
+              </w:rPr>
+              <w:t xml:space="preserve">MODFLOW 6 runs</w:t>
+            </w:r>
+          </w:p>
+        </w:tc>
+      </w:tr>
+      <w:tr>
+        <w:tc>
+          <w:tcPr>
+            <w:tcW w:type="dxa" w:w="4200"/>
+          </w:tcPr>
+          <w:p>
+            <w:pPr>
+              <w:spacing w:after="20"/>
+            </w:pPr>
+            <w:r>
+              <w:rPr>
+                <w:sz w:val="18"/>
+              </w:rPr>
+              <w:t xml:space="preserve">Model build + PEST setup (pest_prep, build_pst)</w:t>
+            </w:r>
+          </w:p>
+        </w:tc>
+        <w:tc>
+          <w:tcPr>
+            <w:tcW w:type="dxa" w:w="2544"/>
+          </w:tcPr>
+          <w:p>
+            <w:pPr>
+              <w:spacing w:after="20"/>
+            </w:pPr>
+            <w:r>
+              <w:rPr>
+                <w:sz w:val="18"/>
+              </w:rPr>
+              <w:t xml:space="preserve">~1 h</w:t>
+            </w:r>
+          </w:p>
+        </w:tc>
+        <w:tc>
+          <w:tcPr>
+            <w:tcW w:type="dxa" w:w="2544"/>
+          </w:tcPr>
+          <w:p>
+            <w:pPr>
+              <w:spacing w:after="20"/>
+            </w:pPr>
+            <w:r>
+              <w:rPr>
+                <w:sz w:val="18"/>
+              </w:rPr>
+              <w:t xml:space="preserve">1</w:t>
+            </w:r>
+          </w:p>
+        </w:tc>
+      </w:tr>
+      <w:tr>
+        <w:tc>
+          <w:tcPr>
+            <w:tcW w:type="dxa" w:w="4200"/>
+          </w:tcPr>
+          <w:p>
+            <w:pPr>
+              <w:spacing w:after="20"/>
+            </w:pPr>
+            <w:r>
+              <w:rPr>
+                <w:sz w:val="18"/>
+              </w:rPr>
+              <w:t xml:space="preserve">Base run (interface + weights)</w:t>
+            </w:r>
+          </w:p>
+        </w:tc>
+        <w:tc>
+          <w:tcPr>
+            <w:tcW w:type="dxa" w:w="2544"/>
+          </w:tcPr>
+          <w:p>
+            <w:pPr>
+              <w:spacing w:after="20"/>
+            </w:pPr>
+            <w:r>
+              <w:rPr>
+                <w:sz w:val="18"/>
+              </w:rPr>
+              <w:t xml:space="preserve">~0.5 h</w:t>
+            </w:r>
+          </w:p>
+        </w:tc>
+        <w:tc>
+          <w:tcPr>
+            <w:tcW w:type="dxa" w:w="2544"/>
+          </w:tcPr>
+          <w:p>
+            <w:pPr>
+              <w:spacing w:after="20"/>
+            </w:pPr>
+            <w:r>
+              <w:rPr>
+                <w:sz w:val="18"/>
+              </w:rPr>
+              <w:t xml:space="preserve">1</w:t>
+            </w:r>
+          </w:p>
+        </w:tc>
+      </w:tr>
+      <w:tr>
+        <w:tc>
+          <w:tcPr>
+            <w:tcW w:type="dxa" w:w="4200"/>
+          </w:tcPr>
+          <w:p>
+            <w:pPr>
+              <w:spacing w:after="20"/>
+            </w:pPr>
+            <w:r>
+              <w:rPr>
+                <w:sz w:val="18"/>
+              </w:rPr>
+              <w:t xml:space="preserve">Prior Monte-Carlo (150 realisations)</w:t>
+            </w:r>
+          </w:p>
+        </w:tc>
+        <w:tc>
+          <w:tcPr>
+            <w:tcW w:type="dxa" w:w="2544"/>
+          </w:tcPr>
+          <w:p>
+            <w:pPr>
+              <w:spacing w:after="20"/>
+            </w:pPr>
+            <w:r>
+              <w:rPr>
+                <w:sz w:val="18"/>
+              </w:rPr>
+              <w:t xml:space="preserve">7.1 h</w:t>
+            </w:r>
+          </w:p>
+        </w:tc>
+        <w:tc>
+          <w:tcPr>
+            <w:tcW w:type="dxa" w:w="2544"/>
+          </w:tcPr>
+          <w:p>
+            <w:pPr>
+              <w:spacing w:after="20"/>
+            </w:pPr>
+            <w:r>
+              <w:rPr>
+                <w:sz w:val="18"/>
+              </w:rPr>
+              <w:t xml:space="preserve">149 ok / 1 fail</w:t>
+            </w:r>
+          </w:p>
+        </w:tc>
+      </w:tr>
+      <w:tr>
+        <w:tc>
+          <w:tcPr>
+            <w:tcW w:type="dxa" w:w="4200"/>
+          </w:tcPr>
+          <w:p>
+            <w:pPr>
+              <w:spacing w:after="20"/>
+            </w:pPr>
+            <w:r>
+              <w:rPr>
+                <w:sz w:val="18"/>
+              </w:rPr>
+              <w:t xml:space="preserve">IES, un-regularised (3 iterations)</w:t>
+            </w:r>
+          </w:p>
+        </w:tc>
+        <w:tc>
+          <w:tcPr>
+            <w:tcW w:type="dxa" w:w="2544"/>
+          </w:tcPr>
+          <w:p>
+            <w:pPr>
+              <w:spacing w:after="20"/>
+            </w:pPr>
+            <w:r>
+              <w:rPr>
+                <w:sz w:val="18"/>
+              </w:rPr>
+              <w:t xml:space="preserve">45.4 h</w:t>
+            </w:r>
+          </w:p>
+        </w:tc>
+        <w:tc>
+          <w:tcPr>
+            <w:tcW w:type="dxa" w:w="2544"/>
+          </w:tcPr>
+          <w:p>
+            <w:pPr>
+              <w:spacing w:after="20"/>
+            </w:pPr>
+            <w:r>
+              <w:rPr>
+                <w:sz w:val="18"/>
+              </w:rPr>
+              <w:t xml:space="preserve">~890 ok / 13 fail</w:t>
+            </w:r>
+          </w:p>
+        </w:tc>
+      </w:tr>
+      <w:tr>
+        <w:tc>
+          <w:tcPr>
+            <w:tcW w:type="dxa" w:w="4200"/>
+          </w:tcPr>
+          <w:p>
+            <w:pPr>
+              <w:spacing w:after="20"/>
+            </w:pPr>
+            <w:r>
+              <w:rPr>
+                <w:sz w:val="18"/>
+              </w:rPr>
+              <w:t xml:space="preserve">IES, regularised reg = 0.5 (3 iterations)</w:t>
+            </w:r>
+          </w:p>
+        </w:tc>
+        <w:tc>
+          <w:tcPr>
+            <w:tcW w:type="dxa" w:w="2544"/>
+          </w:tcPr>
+          <w:p>
+            <w:pPr>
+              <w:spacing w:after="20"/>
+            </w:pPr>
+            <w:r>
+              <w:rPr>
+                <w:sz w:val="18"/>
+              </w:rPr>
+              <w:t xml:space="preserve">51.1 h</w:t>
+            </w:r>
+          </w:p>
+        </w:tc>
+        <w:tc>
+          <w:tcPr>
+            <w:tcW w:type="dxa" w:w="2544"/>
+          </w:tcPr>
+          <w:p>
+            <w:pPr>
+              <w:spacing w:after="20"/>
+            </w:pPr>
+            <w:r>
+              <w:rPr>
+                <w:sz w:val="18"/>
+              </w:rPr>
+              <w:t xml:space="preserve">843 ok / 1 fail</w:t>
+            </w:r>
+          </w:p>
+        </w:tc>
+      </w:tr>
+      <w:tr>
+        <w:tc>
+          <w:tcPr>
+            <w:tcW w:type="dxa" w:w="4200"/>
+          </w:tcPr>
+          <w:p>
+            <w:pPr>
+              <w:spacing w:after="20"/>
+            </w:pPr>
+            <w:r>
+              <w:rPr>
+                <w:sz w:val="18"/>
+              </w:rPr>
+              <w:t xml:space="preserve">Calibrated deterministic run</w:t>
+            </w:r>
+          </w:p>
+        </w:tc>
+        <w:tc>
+          <w:tcPr>
+            <w:tcW w:type="dxa" w:w="2544"/>
+          </w:tcPr>
+          <w:p>
+            <w:pPr>
+              <w:spacing w:after="20"/>
+            </w:pPr>
+            <w:r>
+              <w:rPr>
+                <w:sz w:val="18"/>
+              </w:rPr>
+              <w:t xml:space="preserve">~0.7 h</w:t>
+            </w:r>
+          </w:p>
+        </w:tc>
+        <w:tc>
+          <w:tcPr>
+            <w:tcW w:type="dxa" w:w="2544"/>
+          </w:tcPr>
+          <w:p>
+            <w:pPr>
+              <w:spacing w:after="20"/>
+            </w:pPr>
+            <w:r>
+              <w:rPr>
+                <w:sz w:val="18"/>
+              </w:rPr>
+              <w:t xml:space="preserve">1</w:t>
+            </w:r>
+          </w:p>
+        </w:tc>
+      </w:tr>
+    </w:tbl>
+    <w:p>
+      <w:pPr>
+        <w:spacing w:after="60"/>
+      </w:pPr>
+    </w:p>
+    <w:p>
+      <w:pPr>
+        <w:spacing w:after="80"/>
+      </w:pPr>
+      <w:r>
+        <w:rPr>
+          <w:i/>
+          <w:sz w:val="21"/>
+        </w:rPr>
+        <w:t xml:space="preserve">Total: ~1 900 successful MODFLOW 6 runs and ~105 h of active computation, spanning ~6 days (22–28 Aug 2026) — plus a ~13 h IES attempt lost to the pestpp-ies crash before the workaround, and a short 30-real scaling test. The two IES calibrations dominate the cost.</w:t>
       </w:r>
     </w:p>
     <w:sectPr>

</xml_diff>